<commit_message>
complete quiz 3 advance
</commit_message>
<xml_diff>
--- a/week1/AI_support/quiz3.docx
+++ b/week1/AI_support/quiz3.docx
@@ -305,6 +305,22 @@
     </w:p>
     <w:p>
       <w:pPr>
+        <w:widowControl/>
+        <w:rPr>
+          <w:b/>
+          <w:bCs/>
+        </w:rPr>
+      </w:pPr>
+      <w:r>
+        <w:rPr>
+          <w:b/>
+          <w:bCs/>
+        </w:rPr>
+        <w:br w:type="page"/>
+      </w:r>
+    </w:p>
+    <w:p>
+      <w:pPr>
         <w:jc w:val="center"/>
         <w:rPr>
           <w:b/>
@@ -317,6 +333,7 @@
           <w:b/>
           <w:bCs/>
         </w:rPr>
+        <w:lastRenderedPageBreak/>
         <w:t>Q</w:t>
       </w:r>
       <w:r>
@@ -333,6 +350,593 @@
           <w:bCs/>
         </w:rPr>
         <w:t>進階</w:t>
+      </w:r>
+    </w:p>
+    <w:p>
+      <w:pPr>
+        <w:jc w:val="center"/>
+        <w:rPr>
+          <w:b/>
+          <w:bCs/>
+        </w:rPr>
+      </w:pPr>
+      <w:r>
+        <w:rPr>
+          <w:b/>
+          <w:bCs/>
+        </w:rPr>
+        <w:drawing>
+          <wp:inline distT="0" distB="0" distL="0" distR="0" wp14:anchorId="02EAC923" wp14:editId="3BC31CF1">
+            <wp:extent cx="4320000" cy="2679586"/>
+            <wp:effectExtent l="0" t="0" r="4445" b="6985"/>
+            <wp:docPr id="1" name="圖片 1"/>
+            <wp:cNvGraphicFramePr>
+              <a:graphicFrameLocks xmlns:a="http://schemas.openxmlformats.org/drawingml/2006/main" noChangeAspect="1"/>
+            </wp:cNvGraphicFramePr>
+            <a:graphic xmlns:a="http://schemas.openxmlformats.org/drawingml/2006/main">
+              <a:graphicData uri="http://schemas.openxmlformats.org/drawingml/2006/picture">
+                <pic:pic xmlns:pic="http://schemas.openxmlformats.org/drawingml/2006/picture">
+                  <pic:nvPicPr>
+                    <pic:cNvPr id="1" name=""/>
+                    <pic:cNvPicPr/>
+                  </pic:nvPicPr>
+                  <pic:blipFill>
+                    <a:blip r:embed="rId10"/>
+                    <a:stretch>
+                      <a:fillRect/>
+                    </a:stretch>
+                  </pic:blipFill>
+                  <pic:spPr>
+                    <a:xfrm>
+                      <a:off x="0" y="0"/>
+                      <a:ext cx="4320000" cy="2679586"/>
+                    </a:xfrm>
+                    <a:prstGeom prst="rect">
+                      <a:avLst/>
+                    </a:prstGeom>
+                  </pic:spPr>
+                </pic:pic>
+              </a:graphicData>
+            </a:graphic>
+          </wp:inline>
+        </w:drawing>
+      </w:r>
+      <w:r>
+        <w:rPr>
+          <w:b/>
+          <w:bCs/>
+        </w:rPr>
+        <w:drawing>
+          <wp:inline distT="0" distB="0" distL="0" distR="0" wp14:anchorId="53607C88" wp14:editId="5D4189DA">
+            <wp:extent cx="4320000" cy="1143193"/>
+            <wp:effectExtent l="0" t="0" r="4445" b="0"/>
+            <wp:docPr id="2" name="圖片 2"/>
+            <wp:cNvGraphicFramePr>
+              <a:graphicFrameLocks xmlns:a="http://schemas.openxmlformats.org/drawingml/2006/main" noChangeAspect="1"/>
+            </wp:cNvGraphicFramePr>
+            <a:graphic xmlns:a="http://schemas.openxmlformats.org/drawingml/2006/main">
+              <a:graphicData uri="http://schemas.openxmlformats.org/drawingml/2006/picture">
+                <pic:pic xmlns:pic="http://schemas.openxmlformats.org/drawingml/2006/picture">
+                  <pic:nvPicPr>
+                    <pic:cNvPr id="1" name=""/>
+                    <pic:cNvPicPr/>
+                  </pic:nvPicPr>
+                  <pic:blipFill>
+                    <a:blip r:embed="rId11"/>
+                    <a:stretch>
+                      <a:fillRect/>
+                    </a:stretch>
+                  </pic:blipFill>
+                  <pic:spPr>
+                    <a:xfrm>
+                      <a:off x="0" y="0"/>
+                      <a:ext cx="4320000" cy="1143193"/>
+                    </a:xfrm>
+                    <a:prstGeom prst="rect">
+                      <a:avLst/>
+                    </a:prstGeom>
+                  </pic:spPr>
+                </pic:pic>
+              </a:graphicData>
+            </a:graphic>
+          </wp:inline>
+        </w:drawing>
+      </w:r>
+      <w:r>
+        <w:rPr>
+          <w:b/>
+          <w:bCs/>
+        </w:rPr>
+        <w:drawing>
+          <wp:inline distT="0" distB="0" distL="0" distR="0" wp14:anchorId="014CDD42" wp14:editId="6D9D1021">
+            <wp:extent cx="4320000" cy="2695189"/>
+            <wp:effectExtent l="0" t="0" r="4445" b="0"/>
+            <wp:docPr id="3" name="圖片 3"/>
+            <wp:cNvGraphicFramePr>
+              <a:graphicFrameLocks xmlns:a="http://schemas.openxmlformats.org/drawingml/2006/main" noChangeAspect="1"/>
+            </wp:cNvGraphicFramePr>
+            <a:graphic xmlns:a="http://schemas.openxmlformats.org/drawingml/2006/main">
+              <a:graphicData uri="http://schemas.openxmlformats.org/drawingml/2006/picture">
+                <pic:pic xmlns:pic="http://schemas.openxmlformats.org/drawingml/2006/picture">
+                  <pic:nvPicPr>
+                    <pic:cNvPr id="1" name=""/>
+                    <pic:cNvPicPr/>
+                  </pic:nvPicPr>
+                  <pic:blipFill>
+                    <a:blip r:embed="rId12"/>
+                    <a:stretch>
+                      <a:fillRect/>
+                    </a:stretch>
+                  </pic:blipFill>
+                  <pic:spPr>
+                    <a:xfrm>
+                      <a:off x="0" y="0"/>
+                      <a:ext cx="4320000" cy="2695189"/>
+                    </a:xfrm>
+                    <a:prstGeom prst="rect">
+                      <a:avLst/>
+                    </a:prstGeom>
+                  </pic:spPr>
+                </pic:pic>
+              </a:graphicData>
+            </a:graphic>
+          </wp:inline>
+        </w:drawing>
+      </w:r>
+      <w:r>
+        <w:rPr>
+          <w:b/>
+          <w:bCs/>
+        </w:rPr>
+        <w:lastRenderedPageBreak/>
+        <w:drawing>
+          <wp:inline distT="0" distB="0" distL="0" distR="0" wp14:anchorId="4F70F54E" wp14:editId="55D73AF7">
+            <wp:extent cx="4320000" cy="2712353"/>
+            <wp:effectExtent l="0" t="0" r="4445" b="0"/>
+            <wp:docPr id="4" name="圖片 4"/>
+            <wp:cNvGraphicFramePr>
+              <a:graphicFrameLocks xmlns:a="http://schemas.openxmlformats.org/drawingml/2006/main" noChangeAspect="1"/>
+            </wp:cNvGraphicFramePr>
+            <a:graphic xmlns:a="http://schemas.openxmlformats.org/drawingml/2006/main">
+              <a:graphicData uri="http://schemas.openxmlformats.org/drawingml/2006/picture">
+                <pic:pic xmlns:pic="http://schemas.openxmlformats.org/drawingml/2006/picture">
+                  <pic:nvPicPr>
+                    <pic:cNvPr id="1" name=""/>
+                    <pic:cNvPicPr/>
+                  </pic:nvPicPr>
+                  <pic:blipFill>
+                    <a:blip r:embed="rId13"/>
+                    <a:stretch>
+                      <a:fillRect/>
+                    </a:stretch>
+                  </pic:blipFill>
+                  <pic:spPr>
+                    <a:xfrm>
+                      <a:off x="0" y="0"/>
+                      <a:ext cx="4320000" cy="2712353"/>
+                    </a:xfrm>
+                    <a:prstGeom prst="rect">
+                      <a:avLst/>
+                    </a:prstGeom>
+                  </pic:spPr>
+                </pic:pic>
+              </a:graphicData>
+            </a:graphic>
+          </wp:inline>
+        </w:drawing>
+      </w:r>
+      <w:r>
+        <w:rPr>
+          <w:b/>
+          <w:bCs/>
+        </w:rPr>
+        <w:drawing>
+          <wp:inline distT="0" distB="0" distL="0" distR="0" wp14:anchorId="61CEF4FE" wp14:editId="41740797">
+            <wp:extent cx="4320000" cy="2738358"/>
+            <wp:effectExtent l="0" t="0" r="4445" b="5080"/>
+            <wp:docPr id="5" name="圖片 5"/>
+            <wp:cNvGraphicFramePr>
+              <a:graphicFrameLocks xmlns:a="http://schemas.openxmlformats.org/drawingml/2006/main" noChangeAspect="1"/>
+            </wp:cNvGraphicFramePr>
+            <a:graphic xmlns:a="http://schemas.openxmlformats.org/drawingml/2006/main">
+              <a:graphicData uri="http://schemas.openxmlformats.org/drawingml/2006/picture">
+                <pic:pic xmlns:pic="http://schemas.openxmlformats.org/drawingml/2006/picture">
+                  <pic:nvPicPr>
+                    <pic:cNvPr id="1" name=""/>
+                    <pic:cNvPicPr/>
+                  </pic:nvPicPr>
+                  <pic:blipFill>
+                    <a:blip r:embed="rId14"/>
+                    <a:stretch>
+                      <a:fillRect/>
+                    </a:stretch>
+                  </pic:blipFill>
+                  <pic:spPr>
+                    <a:xfrm>
+                      <a:off x="0" y="0"/>
+                      <a:ext cx="4320000" cy="2738358"/>
+                    </a:xfrm>
+                    <a:prstGeom prst="rect">
+                      <a:avLst/>
+                    </a:prstGeom>
+                  </pic:spPr>
+                </pic:pic>
+              </a:graphicData>
+            </a:graphic>
+          </wp:inline>
+        </w:drawing>
+      </w:r>
+      <w:r>
+        <w:rPr>
+          <w:b/>
+          <w:bCs/>
+        </w:rPr>
+        <w:drawing>
+          <wp:inline distT="0" distB="0" distL="0" distR="0" wp14:anchorId="07C9D33E" wp14:editId="08E28A67">
+            <wp:extent cx="4320000" cy="2720674"/>
+            <wp:effectExtent l="0" t="0" r="4445" b="3810"/>
+            <wp:docPr id="6" name="圖片 6"/>
+            <wp:cNvGraphicFramePr>
+              <a:graphicFrameLocks xmlns:a="http://schemas.openxmlformats.org/drawingml/2006/main" noChangeAspect="1"/>
+            </wp:cNvGraphicFramePr>
+            <a:graphic xmlns:a="http://schemas.openxmlformats.org/drawingml/2006/main">
+              <a:graphicData uri="http://schemas.openxmlformats.org/drawingml/2006/picture">
+                <pic:pic xmlns:pic="http://schemas.openxmlformats.org/drawingml/2006/picture">
+                  <pic:nvPicPr>
+                    <pic:cNvPr id="1" name=""/>
+                    <pic:cNvPicPr/>
+                  </pic:nvPicPr>
+                  <pic:blipFill>
+                    <a:blip r:embed="rId15"/>
+                    <a:stretch>
+                      <a:fillRect/>
+                    </a:stretch>
+                  </pic:blipFill>
+                  <pic:spPr>
+                    <a:xfrm>
+                      <a:off x="0" y="0"/>
+                      <a:ext cx="4320000" cy="2720674"/>
+                    </a:xfrm>
+                    <a:prstGeom prst="rect">
+                      <a:avLst/>
+                    </a:prstGeom>
+                  </pic:spPr>
+                </pic:pic>
+              </a:graphicData>
+            </a:graphic>
+          </wp:inline>
+        </w:drawing>
+      </w:r>
+      <w:r>
+        <w:rPr>
+          <w:b/>
+          <w:bCs/>
+        </w:rPr>
+        <w:lastRenderedPageBreak/>
+        <w:drawing>
+          <wp:inline distT="0" distB="0" distL="0" distR="0" wp14:anchorId="06D39B1E" wp14:editId="19C85782">
+            <wp:extent cx="4320000" cy="1817250"/>
+            <wp:effectExtent l="0" t="0" r="4445" b="0"/>
+            <wp:docPr id="7" name="圖片 7"/>
+            <wp:cNvGraphicFramePr>
+              <a:graphicFrameLocks xmlns:a="http://schemas.openxmlformats.org/drawingml/2006/main" noChangeAspect="1"/>
+            </wp:cNvGraphicFramePr>
+            <a:graphic xmlns:a="http://schemas.openxmlformats.org/drawingml/2006/main">
+              <a:graphicData uri="http://schemas.openxmlformats.org/drawingml/2006/picture">
+                <pic:pic xmlns:pic="http://schemas.openxmlformats.org/drawingml/2006/picture">
+                  <pic:nvPicPr>
+                    <pic:cNvPr id="1" name=""/>
+                    <pic:cNvPicPr/>
+                  </pic:nvPicPr>
+                  <pic:blipFill>
+                    <a:blip r:embed="rId16"/>
+                    <a:stretch>
+                      <a:fillRect/>
+                    </a:stretch>
+                  </pic:blipFill>
+                  <pic:spPr>
+                    <a:xfrm>
+                      <a:off x="0" y="0"/>
+                      <a:ext cx="4320000" cy="1817250"/>
+                    </a:xfrm>
+                    <a:prstGeom prst="rect">
+                      <a:avLst/>
+                    </a:prstGeom>
+                  </pic:spPr>
+                </pic:pic>
+              </a:graphicData>
+            </a:graphic>
+          </wp:inline>
+        </w:drawing>
+      </w:r>
+      <w:r>
+        <w:rPr>
+          <w:b/>
+          <w:bCs/>
+        </w:rPr>
+        <w:drawing>
+          <wp:inline distT="0" distB="0" distL="0" distR="0" wp14:anchorId="4768E58E" wp14:editId="2F5A4D49">
+            <wp:extent cx="4320000" cy="2836138"/>
+            <wp:effectExtent l="0" t="0" r="4445" b="2540"/>
+            <wp:docPr id="8" name="圖片 8"/>
+            <wp:cNvGraphicFramePr>
+              <a:graphicFrameLocks xmlns:a="http://schemas.openxmlformats.org/drawingml/2006/main" noChangeAspect="1"/>
+            </wp:cNvGraphicFramePr>
+            <a:graphic xmlns:a="http://schemas.openxmlformats.org/drawingml/2006/main">
+              <a:graphicData uri="http://schemas.openxmlformats.org/drawingml/2006/picture">
+                <pic:pic xmlns:pic="http://schemas.openxmlformats.org/drawingml/2006/picture">
+                  <pic:nvPicPr>
+                    <pic:cNvPr id="1" name=""/>
+                    <pic:cNvPicPr/>
+                  </pic:nvPicPr>
+                  <pic:blipFill>
+                    <a:blip r:embed="rId17"/>
+                    <a:stretch>
+                      <a:fillRect/>
+                    </a:stretch>
+                  </pic:blipFill>
+                  <pic:spPr>
+                    <a:xfrm>
+                      <a:off x="0" y="0"/>
+                      <a:ext cx="4320000" cy="2836138"/>
+                    </a:xfrm>
+                    <a:prstGeom prst="rect">
+                      <a:avLst/>
+                    </a:prstGeom>
+                  </pic:spPr>
+                </pic:pic>
+              </a:graphicData>
+            </a:graphic>
+          </wp:inline>
+        </w:drawing>
+      </w:r>
+      <w:r>
+        <w:rPr>
+          <w:b/>
+          <w:bCs/>
+        </w:rPr>
+        <w:drawing>
+          <wp:inline distT="0" distB="0" distL="0" distR="0" wp14:anchorId="5EE3A334" wp14:editId="74317237">
+            <wp:extent cx="4320000" cy="2960963"/>
+            <wp:effectExtent l="0" t="0" r="4445" b="0"/>
+            <wp:docPr id="9" name="圖片 9"/>
+            <wp:cNvGraphicFramePr>
+              <a:graphicFrameLocks xmlns:a="http://schemas.openxmlformats.org/drawingml/2006/main" noChangeAspect="1"/>
+            </wp:cNvGraphicFramePr>
+            <a:graphic xmlns:a="http://schemas.openxmlformats.org/drawingml/2006/main">
+              <a:graphicData uri="http://schemas.openxmlformats.org/drawingml/2006/picture">
+                <pic:pic xmlns:pic="http://schemas.openxmlformats.org/drawingml/2006/picture">
+                  <pic:nvPicPr>
+                    <pic:cNvPr id="1" name=""/>
+                    <pic:cNvPicPr/>
+                  </pic:nvPicPr>
+                  <pic:blipFill>
+                    <a:blip r:embed="rId18"/>
+                    <a:stretch>
+                      <a:fillRect/>
+                    </a:stretch>
+                  </pic:blipFill>
+                  <pic:spPr>
+                    <a:xfrm>
+                      <a:off x="0" y="0"/>
+                      <a:ext cx="4320000" cy="2960963"/>
+                    </a:xfrm>
+                    <a:prstGeom prst="rect">
+                      <a:avLst/>
+                    </a:prstGeom>
+                  </pic:spPr>
+                </pic:pic>
+              </a:graphicData>
+            </a:graphic>
+          </wp:inline>
+        </w:drawing>
+      </w:r>
+      <w:r>
+        <w:rPr>
+          <w:b/>
+          <w:bCs/>
+        </w:rPr>
+        <w:lastRenderedPageBreak/>
+        <w:drawing>
+          <wp:inline distT="0" distB="0" distL="0" distR="0" wp14:anchorId="59CCC63F" wp14:editId="0883FE25">
+            <wp:extent cx="4320000" cy="1207686"/>
+            <wp:effectExtent l="0" t="0" r="4445" b="0"/>
+            <wp:docPr id="10" name="圖片 10"/>
+            <wp:cNvGraphicFramePr>
+              <a:graphicFrameLocks xmlns:a="http://schemas.openxmlformats.org/drawingml/2006/main" noChangeAspect="1"/>
+            </wp:cNvGraphicFramePr>
+            <a:graphic xmlns:a="http://schemas.openxmlformats.org/drawingml/2006/main">
+              <a:graphicData uri="http://schemas.openxmlformats.org/drawingml/2006/picture">
+                <pic:pic xmlns:pic="http://schemas.openxmlformats.org/drawingml/2006/picture">
+                  <pic:nvPicPr>
+                    <pic:cNvPr id="1" name=""/>
+                    <pic:cNvPicPr/>
+                  </pic:nvPicPr>
+                  <pic:blipFill>
+                    <a:blip r:embed="rId19"/>
+                    <a:stretch>
+                      <a:fillRect/>
+                    </a:stretch>
+                  </pic:blipFill>
+                  <pic:spPr>
+                    <a:xfrm>
+                      <a:off x="0" y="0"/>
+                      <a:ext cx="4320000" cy="1207686"/>
+                    </a:xfrm>
+                    <a:prstGeom prst="rect">
+                      <a:avLst/>
+                    </a:prstGeom>
+                  </pic:spPr>
+                </pic:pic>
+              </a:graphicData>
+            </a:graphic>
+          </wp:inline>
+        </w:drawing>
+      </w:r>
+      <w:r>
+        <w:rPr>
+          <w:b/>
+          <w:bCs/>
+        </w:rPr>
+        <w:drawing>
+          <wp:inline distT="0" distB="0" distL="0" distR="0" wp14:anchorId="3107E979" wp14:editId="4F8C0419">
+            <wp:extent cx="4320000" cy="3076427"/>
+            <wp:effectExtent l="0" t="0" r="4445" b="0"/>
+            <wp:docPr id="13" name="圖片 13"/>
+            <wp:cNvGraphicFramePr>
+              <a:graphicFrameLocks xmlns:a="http://schemas.openxmlformats.org/drawingml/2006/main" noChangeAspect="1"/>
+            </wp:cNvGraphicFramePr>
+            <a:graphic xmlns:a="http://schemas.openxmlformats.org/drawingml/2006/main">
+              <a:graphicData uri="http://schemas.openxmlformats.org/drawingml/2006/picture">
+                <pic:pic xmlns:pic="http://schemas.openxmlformats.org/drawingml/2006/picture">
+                  <pic:nvPicPr>
+                    <pic:cNvPr id="1" name=""/>
+                    <pic:cNvPicPr/>
+                  </pic:nvPicPr>
+                  <pic:blipFill>
+                    <a:blip r:embed="rId20"/>
+                    <a:stretch>
+                      <a:fillRect/>
+                    </a:stretch>
+                  </pic:blipFill>
+                  <pic:spPr>
+                    <a:xfrm>
+                      <a:off x="0" y="0"/>
+                      <a:ext cx="4320000" cy="3076427"/>
+                    </a:xfrm>
+                    <a:prstGeom prst="rect">
+                      <a:avLst/>
+                    </a:prstGeom>
+                  </pic:spPr>
+                </pic:pic>
+              </a:graphicData>
+            </a:graphic>
+          </wp:inline>
+        </w:drawing>
+      </w:r>
+      <w:r>
+        <w:rPr>
+          <w:b/>
+          <w:bCs/>
+        </w:rPr>
+        <w:drawing>
+          <wp:inline distT="0" distB="0" distL="0" distR="0" wp14:anchorId="76119A63" wp14:editId="4783F134">
+            <wp:extent cx="4320000" cy="2960963"/>
+            <wp:effectExtent l="0" t="0" r="4445" b="0"/>
+            <wp:docPr id="14" name="圖片 14"/>
+            <wp:cNvGraphicFramePr>
+              <a:graphicFrameLocks xmlns:a="http://schemas.openxmlformats.org/drawingml/2006/main" noChangeAspect="1"/>
+            </wp:cNvGraphicFramePr>
+            <a:graphic xmlns:a="http://schemas.openxmlformats.org/drawingml/2006/main">
+              <a:graphicData uri="http://schemas.openxmlformats.org/drawingml/2006/picture">
+                <pic:pic xmlns:pic="http://schemas.openxmlformats.org/drawingml/2006/picture">
+                  <pic:nvPicPr>
+                    <pic:cNvPr id="1" name=""/>
+                    <pic:cNvPicPr/>
+                  </pic:nvPicPr>
+                  <pic:blipFill>
+                    <a:blip r:embed="rId21"/>
+                    <a:stretch>
+                      <a:fillRect/>
+                    </a:stretch>
+                  </pic:blipFill>
+                  <pic:spPr>
+                    <a:xfrm>
+                      <a:off x="0" y="0"/>
+                      <a:ext cx="4320000" cy="2960963"/>
+                    </a:xfrm>
+                    <a:prstGeom prst="rect">
+                      <a:avLst/>
+                    </a:prstGeom>
+                  </pic:spPr>
+                </pic:pic>
+              </a:graphicData>
+            </a:graphic>
+          </wp:inline>
+        </w:drawing>
+      </w:r>
+      <w:r>
+        <w:rPr>
+          <w:b/>
+          <w:bCs/>
+        </w:rPr>
+        <w:lastRenderedPageBreak/>
+        <w:drawing>
+          <wp:inline distT="0" distB="0" distL="0" distR="0" wp14:anchorId="5DB0287D" wp14:editId="19D44153">
+            <wp:extent cx="4320000" cy="1743395"/>
+            <wp:effectExtent l="0" t="0" r="4445" b="9525"/>
+            <wp:docPr id="15" name="圖片 15"/>
+            <wp:cNvGraphicFramePr>
+              <a:graphicFrameLocks xmlns:a="http://schemas.openxmlformats.org/drawingml/2006/main" noChangeAspect="1"/>
+            </wp:cNvGraphicFramePr>
+            <a:graphic xmlns:a="http://schemas.openxmlformats.org/drawingml/2006/main">
+              <a:graphicData uri="http://schemas.openxmlformats.org/drawingml/2006/picture">
+                <pic:pic xmlns:pic="http://schemas.openxmlformats.org/drawingml/2006/picture">
+                  <pic:nvPicPr>
+                    <pic:cNvPr id="1" name=""/>
+                    <pic:cNvPicPr/>
+                  </pic:nvPicPr>
+                  <pic:blipFill>
+                    <a:blip r:embed="rId22"/>
+                    <a:stretch>
+                      <a:fillRect/>
+                    </a:stretch>
+                  </pic:blipFill>
+                  <pic:spPr>
+                    <a:xfrm>
+                      <a:off x="0" y="0"/>
+                      <a:ext cx="4320000" cy="1743395"/>
+                    </a:xfrm>
+                    <a:prstGeom prst="rect">
+                      <a:avLst/>
+                    </a:prstGeom>
+                  </pic:spPr>
+                </pic:pic>
+              </a:graphicData>
+            </a:graphic>
+          </wp:inline>
+        </w:drawing>
+      </w:r>
+      <w:r>
+        <w:rPr>
+          <w:b/>
+          <w:bCs/>
+        </w:rPr>
+        <w:drawing>
+          <wp:inline distT="0" distB="0" distL="0" distR="0" wp14:anchorId="699DDF17" wp14:editId="0C175370">
+            <wp:extent cx="4320000" cy="2902711"/>
+            <wp:effectExtent l="0" t="0" r="4445" b="0"/>
+            <wp:docPr id="16" name="圖片 16"/>
+            <wp:cNvGraphicFramePr>
+              <a:graphicFrameLocks xmlns:a="http://schemas.openxmlformats.org/drawingml/2006/main" noChangeAspect="1"/>
+            </wp:cNvGraphicFramePr>
+            <a:graphic xmlns:a="http://schemas.openxmlformats.org/drawingml/2006/main">
+              <a:graphicData uri="http://schemas.openxmlformats.org/drawingml/2006/picture">
+                <pic:pic xmlns:pic="http://schemas.openxmlformats.org/drawingml/2006/picture">
+                  <pic:nvPicPr>
+                    <pic:cNvPr id="1" name=""/>
+                    <pic:cNvPicPr/>
+                  </pic:nvPicPr>
+                  <pic:blipFill>
+                    <a:blip r:embed="rId23"/>
+                    <a:stretch>
+                      <a:fillRect/>
+                    </a:stretch>
+                  </pic:blipFill>
+                  <pic:spPr>
+                    <a:xfrm>
+                      <a:off x="0" y="0"/>
+                      <a:ext cx="4320000" cy="2902711"/>
+                    </a:xfrm>
+                    <a:prstGeom prst="rect">
+                      <a:avLst/>
+                    </a:prstGeom>
+                  </pic:spPr>
+                </pic:pic>
+              </a:graphicData>
+            </a:graphic>
+          </wp:inline>
+        </w:drawing>
       </w:r>
     </w:p>
     <w:sectPr>

</xml_diff>